<commit_message>
Trim the feature list to match the product
Areas setup came out of the app, so it comes out of the list. Setting the
depot is now its own line rather than buried in day settings, because it
is the one thing a new team actually has to do. Fifteen features.

Co-Authored-By: Claude Opus 5 (1M context) <noreply@anthropic.com>
</commit_message>
<xml_diff>
--- a/docs/Cleaning-Feature-List.docx
+++ b/docs/Cleaning-Feature-List.docx
@@ -40,7 +40,7 @@
           <w:sz w:val="18"/>
           <w:szCs w:val="18"/>
         </w:rPr>
-        <w:t xml:space="preserve">Rev 1  ·  18 September 2026  ·  Confidential</w:t>
+        <w:t xml:space="preserve">Rev 2  ·  18 September 2026  ·  Confidential</w:t>
       </w:r>
     </w:p>
     <w:p>
@@ -59,7 +59,7 @@
           <w:sz w:val="20"/>
           <w:szCs w:val="20"/>
         </w:rPr>
-        <w:t xml:space="preserve">Sixteen features for one cleaning team running one service in Lebanon. The product is a single screen: the day’s schedule beside a map of the route. Everything below serves the one question the business has each time the phone rings — can this customer be fitted into the day.</w:t>
+        <w:t xml:space="preserve">Fifteen features for one cleaning team running one service in Lebanon. The product is a single screen: the day’s schedule beside a map of the route. Everything below serves the one question the business has each time the phone rings — can this customer be fitted into the day.</w:t>
       </w:r>
     </w:p>
     <w:tbl>
@@ -372,7 +372,7 @@
                 <w:sz w:val="20"/>
                 <w:szCs w:val="20"/>
               </w:rPr>
-              <w:t xml:space="preserve">3</w:t>
+              <w:t xml:space="preserve">2</w:t>
             </w:r>
           </w:p>
         </w:tc>
@@ -520,7 +520,7 @@
                 <w:sz w:val="20"/>
                 <w:szCs w:val="20"/>
               </w:rPr>
-              <w:t xml:space="preserve">16</w:t>
+              <w:t xml:space="preserve">15</w:t>
             </w:r>
           </w:p>
         </w:tc>
@@ -1928,7 +1928,7 @@
           <w:sz w:val="16"/>
           <w:szCs w:val="16"/>
         </w:rPr>
-        <w:t xml:space="preserve">     3 FEATURES</w:t>
+        <w:t xml:space="preserve">     2 FEATURES</w:t>
       </w:r>
     </w:p>
     <w:tbl>
@@ -2277,116 +2277,6 @@
                 <w:szCs w:val="20"/>
               </w:rPr>
               <w:t xml:space="preserve">Kept against the customer for next time</w:t>
-            </w:r>
-          </w:p>
-        </w:tc>
-      </w:tr>
-      <w:tr>
-        <w:tc>
-          <w:tcPr>
-            <w:tcW w:type="dxa" w:w="1500"/>
-            <w:tcBorders>
-              <w:top w:val="single" w:color="000000" w:sz="4"/>
-              <w:left w:val="single" w:color="000000" w:sz="4"/>
-              <w:bottom w:val="single" w:color="000000" w:sz="4"/>
-              <w:right w:val="single" w:color="000000" w:sz="4"/>
-            </w:tcBorders>
-            <w:tcMar>
-              <w:top w:type="dxa" w:w="90"/>
-              <w:left w:type="dxa" w:w="120"/>
-              <w:bottom w:type="dxa" w:w="90"/>
-              <w:right w:type="dxa" w:w="120"/>
-            </w:tcMar>
-          </w:tcPr>
-          <w:p>
-            <w:pPr>
-              <w:spacing w:after="0" w:before="0" w:line="250" w:lineRule="auto"/>
-            </w:pPr>
-            <w:r>
-              <w:rPr>
-                <w:rFonts w:ascii="Calibri" w:cs="Calibri" w:eastAsia="Calibri" w:hAnsi="Calibri"/>
-                <w:b/>
-                <w:bCs/>
-                <w:i w:val="false"/>
-                <w:iCs w:val="false"/>
-                <w:caps w:val="false"/>
-                <w:color w:val="1f2a37"/>
-                <w:sz w:val="20"/>
-                <w:szCs w:val="20"/>
-              </w:rPr>
-              <w:t xml:space="preserve">LOC-03</w:t>
-            </w:r>
-          </w:p>
-        </w:tc>
-        <w:tc>
-          <w:tcPr>
-            <w:tcW w:type="dxa" w:w="3900"/>
-            <w:tcBorders>
-              <w:top w:val="single" w:color="000000" w:sz="4"/>
-              <w:left w:val="single" w:color="000000" w:sz="4"/>
-              <w:bottom w:val="single" w:color="000000" w:sz="4"/>
-              <w:right w:val="single" w:color="000000" w:sz="4"/>
-            </w:tcBorders>
-            <w:tcMar>
-              <w:top w:type="dxa" w:w="90"/>
-              <w:left w:type="dxa" w:w="120"/>
-              <w:bottom w:type="dxa" w:w="90"/>
-              <w:right w:type="dxa" w:w="120"/>
-            </w:tcMar>
-          </w:tcPr>
-          <w:p>
-            <w:pPr>
-              <w:spacing w:after="0" w:before="0" w:line="250" w:lineRule="auto"/>
-            </w:pPr>
-            <w:r>
-              <w:rPr>
-                <w:rFonts w:ascii="Calibri" w:cs="Calibri" w:eastAsia="Calibri" w:hAnsi="Calibri"/>
-                <w:b w:val="false"/>
-                <w:bCs w:val="false"/>
-                <w:i w:val="false"/>
-                <w:iCs w:val="false"/>
-                <w:caps w:val="false"/>
-                <w:color w:val="1f2a37"/>
-                <w:sz w:val="20"/>
-                <w:szCs w:val="20"/>
-              </w:rPr>
-              <w:t xml:space="preserve">Areas</w:t>
-            </w:r>
-          </w:p>
-        </w:tc>
-        <w:tc>
-          <w:tcPr>
-            <w:tcW w:type="dxa" w:w="3960"/>
-            <w:tcBorders>
-              <w:top w:val="single" w:color="000000" w:sz="4"/>
-              <w:left w:val="single" w:color="000000" w:sz="4"/>
-              <w:bottom w:val="single" w:color="000000" w:sz="4"/>
-              <w:right w:val="single" w:color="000000" w:sz="4"/>
-            </w:tcBorders>
-            <w:tcMar>
-              <w:top w:type="dxa" w:w="90"/>
-              <w:left w:type="dxa" w:w="120"/>
-              <w:bottom w:type="dxa" w:w="90"/>
-              <w:right w:type="dxa" w:w="120"/>
-            </w:tcMar>
-          </w:tcPr>
-          <w:p>
-            <w:pPr>
-              <w:spacing w:after="0" w:before="0" w:line="250" w:lineRule="auto"/>
-            </w:pPr>
-            <w:r>
-              <w:rPr>
-                <w:rFonts w:ascii="Calibri" w:cs="Calibri" w:eastAsia="Calibri" w:hAnsi="Calibri"/>
-                <w:b w:val="false"/>
-                <w:bCs w:val="false"/>
-                <w:i w:val="false"/>
-                <w:iCs w:val="false"/>
-                <w:caps w:val="false"/>
-                <w:color w:val="1f2a37"/>
-                <w:sz w:val="20"/>
-                <w:szCs w:val="20"/>
-              </w:rPr>
-              <w:t xml:space="preserve">Towns grouped into the team’s areas</w:t>
             </w:r>
           </w:p>
         </w:tc>
@@ -2862,7 +2752,7 @@
                 <w:sz w:val="20"/>
                 <w:szCs w:val="20"/>
               </w:rPr>
-              <w:t xml:space="preserve">Day settings</w:t>
+              <w:t xml:space="preserve">Set your depot</w:t>
             </w:r>
           </w:p>
         </w:tc>
@@ -2898,7 +2788,7 @@
                 <w:sz w:val="20"/>
                 <w:szCs w:val="20"/>
               </w:rPr>
-              <w:t xml:space="preserve">Depot, working hours, default job length</w:t>
+              <w:t xml:space="preserve">Search, paste a map link, or click the map</w:t>
             </w:r>
           </w:p>
         </w:tc>
@@ -2972,7 +2862,7 @@
                 <w:sz w:val="20"/>
                 <w:szCs w:val="20"/>
               </w:rPr>
-              <w:t xml:space="preserve">Areas setup</w:t>
+              <w:t xml:space="preserve">Day settings</w:t>
             </w:r>
           </w:p>
         </w:tc>
@@ -3008,7 +2898,7 @@
                 <w:sz w:val="20"/>
                 <w:szCs w:val="20"/>
               </w:rPr>
-              <w:t xml:space="preserve">Add and edit the team’s areas</w:t>
+              <w:t xml:space="preserve">Working hours and default job length</w:t>
             </w:r>
           </w:p>
         </w:tc>
@@ -3030,7 +2920,7 @@
           <w:sz w:val="18"/>
           <w:szCs w:val="18"/>
         </w:rPr>
-        <w:t xml:space="preserve">Assumes the depot location, working hours and the team’s areas are confirmed at the start.</w:t>
+        <w:t xml:space="preserve">The team sets their own depot and working hours inside the app. Nothing needs configuring before the first booking.</w:t>
       </w:r>
     </w:p>
     <w:sectPr>

</xml_diff>

<commit_message>
Drop the customer list from the feature list
Fourteen features, not fifteen. The customer list is a lookup screen, not part of
the daily job, and listing it invites questions about a customer database this
project is not offering to build.

Renumbers the two features after it, corrects the group count, the total, the
section heading and the opening sentence, and removes the note added last
revision that existed only to explain where the customer list lived.

LOC-02 said saved locations were "kept against the customer", which implied the
same records by another name. It now just says the address is remembered.

Co-Authored-By: Claude Opus 5 (1M context) <noreply@anthropic.com>
</commit_message>
<xml_diff>
--- a/docs/Cleaning-Feature-List.docx
+++ b/docs/Cleaning-Feature-List.docx
@@ -40,7 +40,7 @@
           <w:sz w:val="18"/>
           <w:szCs w:val="18"/>
         </w:rPr>
-        <w:t xml:space="preserve">Rev 3  ·  18 September 2026  ·  Confidential</w:t>
+        <w:t xml:space="preserve">Rev 4  ·  18 September 2026  ·  Confidential</w:t>
       </w:r>
     </w:p>
     <w:p>
@@ -59,7 +59,7 @@
           <w:sz w:val="20"/>
           <w:szCs w:val="20"/>
         </w:rPr>
-        <w:t xml:space="preserve">Fifteen features for one cleaning team running one service in Lebanon. The product is a single screen: the day’s schedule beside a map of the route. Everything below serves the one question the business has each time the phone rings — can this customer be fitted into the day.</w:t>
+        <w:t xml:space="preserve">Fourteen features for one cleaning team running one service in Lebanon. The product is a single screen: the day’s schedule beside a map of the route. Everything below serves the one question the business has each time the phone rings — can this customer be fitted into the day.</w:t>
       </w:r>
     </w:p>
     <w:tbl>
@@ -446,7 +446,7 @@
                 <w:sz w:val="20"/>
                 <w:szCs w:val="20"/>
               </w:rPr>
-              <w:t xml:space="preserve">4</w:t>
+              <w:t xml:space="preserve">3</w:t>
             </w:r>
           </w:p>
         </w:tc>
@@ -520,7 +520,7 @@
                 <w:sz w:val="20"/>
                 <w:szCs w:val="20"/>
               </w:rPr>
-              <w:t xml:space="preserve">15</w:t>
+              <w:t xml:space="preserve">14</w:t>
             </w:r>
           </w:p>
         </w:tc>
@@ -2276,7 +2276,7 @@
                 <w:sz w:val="20"/>
                 <w:szCs w:val="20"/>
               </w:rPr>
-              <w:t xml:space="preserve">Kept against the customer for next time</w:t>
+              <w:t xml:space="preserve">The address is remembered for next time</w:t>
             </w:r>
           </w:p>
         </w:tc>
@@ -2330,7 +2330,7 @@
           <w:sz w:val="16"/>
           <w:szCs w:val="16"/>
         </w:rPr>
-        <w:t xml:space="preserve">     4 FEATURES</w:t>
+        <w:t xml:space="preserve">     3 FEATURES</w:t>
       </w:r>
     </w:p>
     <w:tbl>
@@ -2642,7 +2642,7 @@
                 <w:sz w:val="20"/>
                 <w:szCs w:val="20"/>
               </w:rPr>
-              <w:t xml:space="preserve">Customer list</w:t>
+              <w:t xml:space="preserve">Set your depot</w:t>
             </w:r>
           </w:p>
         </w:tc>
@@ -2678,7 +2678,7 @@
                 <w:sz w:val="20"/>
                 <w:szCs w:val="20"/>
               </w:rPr>
-              <w:t xml:space="preserve">Name, phone, saved locations</w:t>
+              <w:t xml:space="preserve">Search, paste a map link, or click the map</w:t>
             </w:r>
           </w:p>
         </w:tc>
@@ -2717,116 +2717,6 @@
                 <w:szCs w:val="20"/>
               </w:rPr>
               <w:t xml:space="preserve">ADM-03</w:t>
-            </w:r>
-          </w:p>
-        </w:tc>
-        <w:tc>
-          <w:tcPr>
-            <w:tcW w:type="dxa" w:w="3900"/>
-            <w:tcBorders>
-              <w:top w:val="single" w:color="000000" w:sz="4"/>
-              <w:left w:val="single" w:color="000000" w:sz="4"/>
-              <w:bottom w:val="single" w:color="000000" w:sz="4"/>
-              <w:right w:val="single" w:color="000000" w:sz="4"/>
-            </w:tcBorders>
-            <w:tcMar>
-              <w:top w:type="dxa" w:w="90"/>
-              <w:left w:type="dxa" w:w="120"/>
-              <w:bottom w:type="dxa" w:w="90"/>
-              <w:right w:type="dxa" w:w="120"/>
-            </w:tcMar>
-          </w:tcPr>
-          <w:p>
-            <w:pPr>
-              <w:spacing w:after="0" w:before="0" w:line="250" w:lineRule="auto"/>
-            </w:pPr>
-            <w:r>
-              <w:rPr>
-                <w:rFonts w:ascii="Calibri" w:cs="Calibri" w:eastAsia="Calibri" w:hAnsi="Calibri"/>
-                <w:b w:val="false"/>
-                <w:bCs w:val="false"/>
-                <w:i w:val="false"/>
-                <w:iCs w:val="false"/>
-                <w:caps w:val="false"/>
-                <w:color w:val="1f2a37"/>
-                <w:sz w:val="20"/>
-                <w:szCs w:val="20"/>
-              </w:rPr>
-              <w:t xml:space="preserve">Set your depot</w:t>
-            </w:r>
-          </w:p>
-        </w:tc>
-        <w:tc>
-          <w:tcPr>
-            <w:tcW w:type="dxa" w:w="3960"/>
-            <w:tcBorders>
-              <w:top w:val="single" w:color="000000" w:sz="4"/>
-              <w:left w:val="single" w:color="000000" w:sz="4"/>
-              <w:bottom w:val="single" w:color="000000" w:sz="4"/>
-              <w:right w:val="single" w:color="000000" w:sz="4"/>
-            </w:tcBorders>
-            <w:tcMar>
-              <w:top w:type="dxa" w:w="90"/>
-              <w:left w:type="dxa" w:w="120"/>
-              <w:bottom w:type="dxa" w:w="90"/>
-              <w:right w:type="dxa" w:w="120"/>
-            </w:tcMar>
-          </w:tcPr>
-          <w:p>
-            <w:pPr>
-              <w:spacing w:after="0" w:before="0" w:line="250" w:lineRule="auto"/>
-            </w:pPr>
-            <w:r>
-              <w:rPr>
-                <w:rFonts w:ascii="Calibri" w:cs="Calibri" w:eastAsia="Calibri" w:hAnsi="Calibri"/>
-                <w:b w:val="false"/>
-                <w:bCs w:val="false"/>
-                <w:i w:val="false"/>
-                <w:iCs w:val="false"/>
-                <w:caps w:val="false"/>
-                <w:color w:val="1f2a37"/>
-                <w:sz w:val="20"/>
-                <w:szCs w:val="20"/>
-              </w:rPr>
-              <w:t xml:space="preserve">Search, paste a map link, or click the map</w:t>
-            </w:r>
-          </w:p>
-        </w:tc>
-      </w:tr>
-      <w:tr>
-        <w:tc>
-          <w:tcPr>
-            <w:tcW w:type="dxa" w:w="1500"/>
-            <w:tcBorders>
-              <w:top w:val="single" w:color="000000" w:sz="4"/>
-              <w:left w:val="single" w:color="000000" w:sz="4"/>
-              <w:bottom w:val="single" w:color="000000" w:sz="4"/>
-              <w:right w:val="single" w:color="000000" w:sz="4"/>
-            </w:tcBorders>
-            <w:tcMar>
-              <w:top w:type="dxa" w:w="90"/>
-              <w:left w:type="dxa" w:w="120"/>
-              <w:bottom w:type="dxa" w:w="90"/>
-              <w:right w:type="dxa" w:w="120"/>
-            </w:tcMar>
-          </w:tcPr>
-          <w:p>
-            <w:pPr>
-              <w:spacing w:after="0" w:before="0" w:line="250" w:lineRule="auto"/>
-            </w:pPr>
-            <w:r>
-              <w:rPr>
-                <w:rFonts w:ascii="Calibri" w:cs="Calibri" w:eastAsia="Calibri" w:hAnsi="Calibri"/>
-                <w:b/>
-                <w:bCs/>
-                <w:i w:val="false"/>
-                <w:iCs w:val="false"/>
-                <w:caps w:val="false"/>
-                <w:color w:val="1f2a37"/>
-                <w:sz w:val="20"/>
-                <w:szCs w:val="20"/>
-              </w:rPr>
-              <w:t xml:space="preserve">ADM-04</w:t>
             </w:r>
           </w:p>
         </w:tc>
@@ -2920,7 +2810,7 @@
           <w:sz w:val="18"/>
           <w:szCs w:val="18"/>
         </w:rPr>
-        <w:t xml:space="preserve">The team sets their own depot and working hours inside the app. Nothing needs configuring before the first booking. The customer list is reachable by URL but is not linked from the main screen, which stays on the day.</w:t>
+        <w:t xml:space="preserve">The team sets their own depot and working hours inside the app. Nothing needs configuring before the first booking.</w:t>
       </w:r>
     </w:p>
     <w:sectPr>

</xml_diff>

<commit_message>
Drop saved locations from the feature list
Thirteen features. Remembering an address is something the app does, not
something the team operates, and listing it reads as a second promise about
stored customer data on top of the list already removed.

Counts, the section heading and the opening sentence follow. The heading is
singular now that Locations holds one entry.

Co-Authored-By: Claude Opus 5 (1M context) <noreply@anthropic.com>
</commit_message>
<xml_diff>
--- a/docs/Cleaning-Feature-List.docx
+++ b/docs/Cleaning-Feature-List.docx
@@ -40,7 +40,7 @@
           <w:sz w:val="18"/>
           <w:szCs w:val="18"/>
         </w:rPr>
-        <w:t xml:space="preserve">Rev 4  ·  18 September 2026  ·  Confidential</w:t>
+        <w:t xml:space="preserve">Rev 5  ·  18 September 2026  ·  Confidential</w:t>
       </w:r>
     </w:p>
     <w:p>
@@ -59,7 +59,7 @@
           <w:sz w:val="20"/>
           <w:szCs w:val="20"/>
         </w:rPr>
-        <w:t xml:space="preserve">Fourteen features for one cleaning team running one service in Lebanon. The product is a single screen: the day’s schedule beside a map of the route. Everything below serves the one question the business has each time the phone rings — can this customer be fitted into the day.</w:t>
+        <w:t xml:space="preserve">Thirteen features for one cleaning team running one service in Lebanon. The product is a single screen: the day’s schedule beside a map of the route. Everything below serves the one question the business has each time the phone rings — can this customer be fitted into the day.</w:t>
       </w:r>
     </w:p>
     <w:tbl>
@@ -372,7 +372,7 @@
                 <w:sz w:val="20"/>
                 <w:szCs w:val="20"/>
               </w:rPr>
-              <w:t xml:space="preserve">2</w:t>
+              <w:t xml:space="preserve">1</w:t>
             </w:r>
           </w:p>
         </w:tc>
@@ -520,7 +520,7 @@
                 <w:sz w:val="20"/>
                 <w:szCs w:val="20"/>
               </w:rPr>
-              <w:t xml:space="preserve">14</w:t>
+              <w:t xml:space="preserve">13</w:t>
             </w:r>
           </w:p>
         </w:tc>
@@ -1928,7 +1928,7 @@
           <w:sz w:val="16"/>
           <w:szCs w:val="16"/>
         </w:rPr>
-        <w:t xml:space="preserve">     2 FEATURES</w:t>
+        <w:t xml:space="preserve">     1 FEATURE</w:t>
       </w:r>
     </w:p>
     <w:tbl>
@@ -2167,116 +2167,6 @@
                 <w:szCs w:val="20"/>
               </w:rPr>
               <w:t xml:space="preserve">Map click, search, or a shared map link</w:t>
-            </w:r>
-          </w:p>
-        </w:tc>
-      </w:tr>
-      <w:tr>
-        <w:tc>
-          <w:tcPr>
-            <w:tcW w:type="dxa" w:w="1500"/>
-            <w:tcBorders>
-              <w:top w:val="single" w:color="000000" w:sz="4"/>
-              <w:left w:val="single" w:color="000000" w:sz="4"/>
-              <w:bottom w:val="single" w:color="000000" w:sz="4"/>
-              <w:right w:val="single" w:color="000000" w:sz="4"/>
-            </w:tcBorders>
-            <w:tcMar>
-              <w:top w:type="dxa" w:w="90"/>
-              <w:left w:type="dxa" w:w="120"/>
-              <w:bottom w:type="dxa" w:w="90"/>
-              <w:right w:type="dxa" w:w="120"/>
-            </w:tcMar>
-          </w:tcPr>
-          <w:p>
-            <w:pPr>
-              <w:spacing w:after="0" w:before="0" w:line="250" w:lineRule="auto"/>
-            </w:pPr>
-            <w:r>
-              <w:rPr>
-                <w:rFonts w:ascii="Calibri" w:cs="Calibri" w:eastAsia="Calibri" w:hAnsi="Calibri"/>
-                <w:b/>
-                <w:bCs/>
-                <w:i w:val="false"/>
-                <w:iCs w:val="false"/>
-                <w:caps w:val="false"/>
-                <w:color w:val="1f2a37"/>
-                <w:sz w:val="20"/>
-                <w:szCs w:val="20"/>
-              </w:rPr>
-              <w:t xml:space="preserve">LOC-02</w:t>
-            </w:r>
-          </w:p>
-        </w:tc>
-        <w:tc>
-          <w:tcPr>
-            <w:tcW w:type="dxa" w:w="3900"/>
-            <w:tcBorders>
-              <w:top w:val="single" w:color="000000" w:sz="4"/>
-              <w:left w:val="single" w:color="000000" w:sz="4"/>
-              <w:bottom w:val="single" w:color="000000" w:sz="4"/>
-              <w:right w:val="single" w:color="000000" w:sz="4"/>
-            </w:tcBorders>
-            <w:tcMar>
-              <w:top w:type="dxa" w:w="90"/>
-              <w:left w:type="dxa" w:w="120"/>
-              <w:bottom w:type="dxa" w:w="90"/>
-              <w:right w:type="dxa" w:w="120"/>
-            </w:tcMar>
-          </w:tcPr>
-          <w:p>
-            <w:pPr>
-              <w:spacing w:after="0" w:before="0" w:line="250" w:lineRule="auto"/>
-            </w:pPr>
-            <w:r>
-              <w:rPr>
-                <w:rFonts w:ascii="Calibri" w:cs="Calibri" w:eastAsia="Calibri" w:hAnsi="Calibri"/>
-                <w:b w:val="false"/>
-                <w:bCs w:val="false"/>
-                <w:i w:val="false"/>
-                <w:iCs w:val="false"/>
-                <w:caps w:val="false"/>
-                <w:color w:val="1f2a37"/>
-                <w:sz w:val="20"/>
-                <w:szCs w:val="20"/>
-              </w:rPr>
-              <w:t xml:space="preserve">Saved locations</w:t>
-            </w:r>
-          </w:p>
-        </w:tc>
-        <w:tc>
-          <w:tcPr>
-            <w:tcW w:type="dxa" w:w="3960"/>
-            <w:tcBorders>
-              <w:top w:val="single" w:color="000000" w:sz="4"/>
-              <w:left w:val="single" w:color="000000" w:sz="4"/>
-              <w:bottom w:val="single" w:color="000000" w:sz="4"/>
-              <w:right w:val="single" w:color="000000" w:sz="4"/>
-            </w:tcBorders>
-            <w:tcMar>
-              <w:top w:type="dxa" w:w="90"/>
-              <w:left w:type="dxa" w:w="120"/>
-              <w:bottom w:type="dxa" w:w="90"/>
-              <w:right w:type="dxa" w:w="120"/>
-            </w:tcMar>
-          </w:tcPr>
-          <w:p>
-            <w:pPr>
-              <w:spacing w:after="0" w:before="0" w:line="250" w:lineRule="auto"/>
-            </w:pPr>
-            <w:r>
-              <w:rPr>
-                <w:rFonts w:ascii="Calibri" w:cs="Calibri" w:eastAsia="Calibri" w:hAnsi="Calibri"/>
-                <w:b w:val="false"/>
-                <w:bCs w:val="false"/>
-                <w:i w:val="false"/>
-                <w:iCs w:val="false"/>
-                <w:caps w:val="false"/>
-                <w:color w:val="1f2a37"/>
-                <w:sz w:val="20"/>
-                <w:szCs w:val="20"/>
-              </w:rPr>
-              <w:t xml:space="preserve">The address is remembered for next time</w:t>
             </w:r>
           </w:p>
         </w:tc>

</xml_diff>